<commit_message>
Open the screenplay with the story told in prose
A reader hit the shot table cold. Now the document explains the plot as
a short narrative first, then gives beats, scenes and shots.

Co-Authored-By: Claude Opus 5 <noreply@anthropic.com>
Claude-Session: https://claude.ai/code/session_01KGXS9NvythRTvjJE8eJdN5
</commit_message>
<xml_diff>
--- a/shahruhiya/export/SHAHRUHIYA-scenariy.docx
+++ b/shahruhiya/export/SHAHRUHIYA-scenariy.docx
@@ -274,6 +274,224 @@
           <w:i w:val="0"/>
         </w:rPr>
         <w:t>MANIFEST.md</w:t>
+      </w:r>
+    </w:p>
+    <w:p>
+      <w:pPr>
+        <w:spacing w:before="360" w:after="160"/>
+        <w:jc w:val="center"/>
+      </w:pPr>
+      <w:r>
+        <w:rPr>
+          <w:rFonts w:ascii="DejaVu Serif" w:hAnsi="DejaVu Serif"/>
+          <w:b/>
+          <w:sz w:val="36"/>
+        </w:rPr>
+        <w:t>ИСТОРИЯ</w:t>
+      </w:r>
+    </w:p>
+    <w:p>
+      <w:r>
+        <w:rPr>
+          <w:rFonts w:ascii="DejaVu Serif" w:hAnsi="DejaVu Serif"/>
+          <w:b w:val="0"/>
+          <w:i/>
+        </w:rPr>
+        <w:t>Прежде чем читать кадры — прочтите, о чём это.</w:t>
+      </w:r>
+    </w:p>
+    <w:p>
+      <w:r>
+        <w:rPr>
+          <w:rFonts w:ascii="DejaVu Serif" w:hAnsi="DejaVu Serif"/>
+          <w:b w:val="0"/>
+          <w:i w:val="0"/>
+        </w:rPr>
+        <w:t>Тошкент, наши дни. Будильник кричит трижды, и только на третий раз Шохрух открывает глаза. 7:47. Встреча в 8:15. Он вылетает из постели, бьётся бедром о косяк, плещет в лицо воду — и выходит из ванной с мокрым пятном на рубашке, которое не успеет высохнуть до конца этого дня. Во дворе старик метёт асфальт и поднимает голову, чтобы поздороваться. Шохрух проходит мимо, не заметив.</w:t>
+      </w:r>
+    </w:p>
+    <w:p>
+      <w:r>
+        <w:rPr>
+          <w:rFonts w:ascii="DejaVu Serif" w:hAnsi="DejaVu Serif"/>
+          <w:b w:val="0"/>
+          <w:i w:val="0"/>
+        </w:rPr>
+        <w:t>Он садится в свою «Нексию», говорит «Бисмиллоҳ» — так же машинально, как поворачивает ключ, — и фары ложатся на лужу. Загорается лампа бензина. Заправка проплывает мимо: некогда. 8:02. Впереди поворот к туннелю у цирка, который он проезжает каждое утро своей жизни.</w:t>
+      </w:r>
+    </w:p>
+    <w:p>
+      <w:r>
+        <w:rPr>
+          <w:rFonts w:ascii="DejaVu Serif" w:hAnsi="DejaVu Serif"/>
+          <w:b w:val="0"/>
+          <w:i w:val="0"/>
+        </w:rPr>
+        <w:t>В туннеле гаснут лампы. Одна, вторая, третья. Потом впереди — белый свет, слишком широкий для выезда.</w:t>
+      </w:r>
+    </w:p>
+    <w:p>
+      <w:r>
+        <w:rPr>
+          <w:rFonts w:ascii="DejaVu Serif" w:hAnsi="DejaVu Serif"/>
+          <w:b w:val="0"/>
+          <w:i w:val="0"/>
+        </w:rPr>
+        <w:t>Он выезжает в степь.</w:t>
+      </w:r>
+    </w:p>
+    <w:p>
+      <w:r>
+        <w:rPr>
+          <w:rFonts w:ascii="DejaVu Serif" w:hAnsi="DejaVu Serif"/>
+          <w:b w:val="0"/>
+          <w:i w:val="0"/>
+        </w:rPr>
+        <w:t>Не в пригород, не на объездную — в голую степь под огромным небом, и в километре от него стоит лагерь: шатры, кони, костры, тысячи людей. Люди в лагере видят машину. Сначала тишина, потом — крик, и войско Амира Темура делает единственное, что можно сделать перед тем, чего не понимаешь: воины падают на колени и читают шахаду. Шохрух, вцепившись в руль, шепчет «Аузу билляҳ» — и в этой точке два страха, разделённые шестью веками, оказываются одним и тем же страхом.</w:t>
+      </w:r>
+    </w:p>
+    <w:p>
+      <w:r>
+        <w:rPr>
+          <w:rFonts w:ascii="DejaVu Serif" w:hAnsi="DejaVu Serif"/>
+          <w:b w:val="0"/>
+          <w:i w:val="0"/>
+        </w:rPr>
+        <w:t>Его вытаскивают, окружают, ощупывают железо. Он пытается объяснить. Слов нет — ни у него для них, ни у них для него. «Это конь», — говорит он в конце концов. Железный конь. «Ёнадиган сув ичади» — пьёт горящую воду. Сколько в нём коней? «Юз етти» — сто семь. По лагерю идёт шёпот: сто семь коней в одном.</w:t>
+      </w:r>
+    </w:p>
+    <w:p>
+      <w:r>
+        <w:rPr>
+          <w:rFonts w:ascii="DejaVu Serif" w:hAnsi="DejaVu Serif"/>
+          <w:b w:val="0"/>
+          <w:i w:val="0"/>
+        </w:rPr>
+        <w:t>Молодой воин Бобур первым перестаёт бояться и начинает спрашивать. Он садится в машину, и Шохрух пристёгивает ему ремень; Бобур учит его настоящему узбекскому, тому, в котором ещё нет ни одного слова, заимствованного после Темура. Между делом Бобур говорит о городе Банокат на Сырдарье, который сожгли и который Амир велел отстроить заново. Шохрух пропускает это мимо ушей.</w:t>
+      </w:r>
+    </w:p>
+    <w:p>
+      <w:r>
+        <w:rPr>
+          <w:rFonts w:ascii="DejaVu Serif" w:hAnsi="DejaVu Serif"/>
+          <w:b w:val="0"/>
+          <w:i w:val="0"/>
+        </w:rPr>
+        <w:t>В шатре Амир Темур смотрит на него долго и не спрашивает ни о железном коне, ни о ста семи конях. Он спрашивает, из какого тот города. Шохрух отвечает: из Ташкента. Темур молчит. «Бундай шаҳар йўқ, — говорит он. — Шош бор». Такого города нет. Есть Шош. И это — самая страшная минута фильма: не мечи, не войско, а одно спокойное предложение, которое стирает твой город с карты мира.</w:t>
+      </w:r>
+    </w:p>
+    <w:p>
+      <w:r>
+        <w:rPr>
+          <w:rFonts w:ascii="DejaVu Serif" w:hAnsi="DejaVu Serif"/>
+          <w:b w:val="0"/>
+          <w:i w:val="0"/>
+        </w:rPr>
+        <w:t>Потом Темур говорит то, что не сказал бы никому из своих: «Сен қўрқаяпсан». Ты боишься. И тут же — дело. Отряд уходит ущельем, в ущелье засада, письмо с предупреждением не успеет: чопар доскачет только к полудню, а бой — на рассвете. Шохрух слышит себя со стороны: он говорит, что довезёт письмо. Ставит условие — Бобур едет с ним. Темур улыбается один раз за весь фильм и отдаёт письмо.</w:t>
+      </w:r>
+    </w:p>
+    <w:p>
+      <w:r>
+        <w:rPr>
+          <w:rFonts w:ascii="DejaVu Serif" w:hAnsi="DejaVu Serif"/>
+          <w:b w:val="0"/>
+          <w:i w:val="0"/>
+        </w:rPr>
+        <w:t>Перед тем как тронуться, Шохрух говорит «Бисмиллоҳ» — те же восемь букв, что утром, но теперь он слышит, что произносит.</w:t>
+      </w:r>
+    </w:p>
+    <w:p>
+      <w:r>
+        <w:rPr>
+          <w:rFonts w:ascii="DejaVu Serif" w:hAnsi="DejaVu Serif"/>
+          <w:b w:val="0"/>
+          <w:i w:val="0"/>
+        </w:rPr>
+        <w:t>Дорога рвётся под колёсами, как рана. На подъёме машина садится, и человек XXI века вместе с воином XIV толкают её плечом к плечу — и это единственный кадр, в котором между ними нет никакой разницы. Они успевают. Шохрух давит на клаксон; отряд останавливается; из скал встаёт засада — «Пистирма!» — и встречает не спину колонны, а развёрнутый строй. К закату всё кончено. Кто-то протягивает ему лепёшку, и он ест её, сидя на земле, среди чужих людей, которые больше не чужие.</w:t>
+      </w:r>
+    </w:p>
+    <w:p>
+      <w:r>
+        <w:rPr>
+          <w:rFonts w:ascii="DejaVu Serif" w:hAnsi="DejaVu Serif"/>
+          <w:b w:val="0"/>
+          <w:i w:val="0"/>
+        </w:rPr>
+        <w:t>«Амир келдилар!» Темур идёт через поле — мимо раненых, мимо живых, мимо своих сотников — к человеку в мокрой рубашке. Он говорит, что отстраивает Банокат и что городу нужно имя. И спрашивает имя гостя. Шохрух отвечает. «Бу шаҳарни сенинг шарафингга Шоҳруҳия деб номлайман». Я назову этот город в твою честь — Шахрухия. Он снимает с пальца перстень и надевает Шохруху. «Сен биринчисан».</w:t>
+      </w:r>
+    </w:p>
+    <w:p>
+      <w:r>
+        <w:rPr>
+          <w:rFonts w:ascii="DejaVu Serif" w:hAnsi="DejaVu Serif"/>
+          <w:b w:val="0"/>
+          <w:i w:val="0"/>
+        </w:rPr>
+        <w:t>Мир начинает таять — степь, костры, лица, Бобур, поднявший руку. Остаётся только перстень.</w:t>
+      </w:r>
+    </w:p>
+    <w:p>
+      <w:r>
+        <w:rPr>
+          <w:rFonts w:ascii="DejaVu Serif" w:hAnsi="DejaVu Serif"/>
+          <w:b w:val="0"/>
+          <w:i w:val="0"/>
+        </w:rPr>
+        <w:t>Туннель. Лампы загораются одна за другой. Шохрух выезжает в Тошкент. На часах 7:48 — прошла одна минута. Но мокрая рубашка не высохла, в баке всё так же пусто, а на пальце — перстень, которого утром не было. Три доказательства, и ни одно ничего не доказывает никому, кроме него.</w:t>
+      </w:r>
+    </w:p>
+    <w:p>
+      <w:r>
+        <w:rPr>
+          <w:rFonts w:ascii="DejaVu Serif" w:hAnsi="DejaVu Serif"/>
+          <w:b w:val="0"/>
+          <w:i w:val="0"/>
+        </w:rPr>
+        <w:t>Он едет дальше и впервые видит город: не дорогу, не светофоры — город. Он останавливается на площади Амира Темура, выходит и смотрит на памятник снизу вверх, как смотрел в шатре. Телефон звонит: 8:15. Он выключает будильник и не берёт трубку.</w:t>
+      </w:r>
+    </w:p>
+    <w:p>
+      <w:r>
+        <w:rPr>
+          <w:rFonts w:ascii="DejaVu Serif" w:hAnsi="DejaVu Serif"/>
+          <w:b w:val="0"/>
+          <w:i w:val="0"/>
+        </w:rPr>
+        <w:t xml:space="preserve">Последнее, что мы видим, — указатель на дороге, мимо которого он проезжал всю жизнь и не читал: </w:t>
+      </w:r>
+      <w:r>
+        <w:rPr>
+          <w:rFonts w:ascii="DejaVu Serif" w:hAnsi="DejaVu Serif"/>
+          <w:b/>
+          <w:i w:val="0"/>
+        </w:rPr>
+        <w:t>ШАҲРУҲИЯ</w:t>
+      </w:r>
+      <w:r>
+        <w:rPr>
+          <w:rFonts w:ascii="DejaVu Serif" w:hAnsi="DejaVu Serif"/>
+          <w:b w:val="0"/>
+          <w:i w:val="0"/>
+        </w:rPr>
+        <w:t>. Город есть. Он стоит на Сырдарье до сих пор.</w:t>
+      </w:r>
+    </w:p>
+    <w:p>
+      <w:r>
+        <w:rPr>
+          <w:rFonts w:ascii="DejaVu Serif" w:hAnsi="DejaVu Serif"/>
+          <w:b/>
+          <w:i w:val="0"/>
+        </w:rPr>
+        <w:t>О чём это.</w:t>
+      </w:r>
+      <w:r>
+        <w:rPr>
+          <w:rFonts w:ascii="DejaVu Serif" w:hAnsi="DejaVu Serif"/>
+          <w:b w:val="0"/>
+          <w:i w:val="0"/>
+        </w:rPr>
+        <w:t xml:space="preserve"> О человеке, который опаздывал на встречу и опаздывал на собственную жизнь: не здоровался со стариком во дворе, говорил «Бисмиллоҳ», не слыша его, жил в городе, не видя города. Чтобы он проснулся, понадобилось шесть веков и одна минута. Фильм не про путешествие во времени — он про то, что имя, вера и город достались тебе от кого-то, и однажды стоит посмотреть, от кого именно.</w:t>
       </w:r>
     </w:p>
     <w:p>

</xml_diff>